<commit_message>
Docs: Word/PDF copies rebuilt from 51a5332 (configuration listings); verification commit references updated
</commit_message>
<xml_diff>
--- a/docs/eosc-basic-compliance-testsuite.docx
+++ b/docs/eosc-basic-compliance-testsuite.docx
@@ -23,7 +23,7 @@
         <w:pStyle w:val="Author"/>
       </w:pPr>
       <w:r>
-        <w:t xml:space="preserve">Clean clone, 26 September 2026 — documentation commit 5701f9e, 357 test cases</w:t>
+        <w:t xml:space="preserve">Clean clone, 26 September 2026 — documentation commit 51a5332, 369 test cases</w:t>
       </w:r>
     </w:p>
     <w:p>
@@ -135,25 +135,10 @@
         <w:rPr>
           <w:rStyle w:val="VerbatimChar"/>
         </w:rPr>
-        <w:t xml:space="preserve">5701f9e</w:t>
-      </w:r>
-      <w:r>
-        <w:t xml:space="preserve">, which added the</w:t>
-      </w:r>
-      <w:r>
-        <w:t xml:space="preserve"> </w:t>
-      </w:r>
-      <w:r>
-        <w:rPr>
-          <w:rStyle w:val="VerbatimChar"/>
-        </w:rPr>
-        <w:t xml:space="preserve">--node</w:t>
-      </w:r>
-      <w:r>
-        <w:t xml:space="preserve"> </w:t>
-      </w:r>
-      <w:r>
-        <w:t xml:space="preserve">option:</w:t>
+        <w:t xml:space="preserve">51a5332</w:t>
+      </w:r>
+      <w:r>
+        <w:t xml:space="preserve">, which added the configuration listings:</w:t>
       </w:r>
       <w:r>
         <w:t xml:space="preserve"> </w:t>
@@ -163,7 +148,7 @@
           <w:b/>
           <w:bCs/>
         </w:rPr>
-        <w:t xml:space="preserve">357 test cases, all passing in CI</w:t>
+        <w:t xml:space="preserve">369 test cases, all passing in CI</w:t>
       </w:r>
       <w:r>
         <w:t xml:space="preserve">. No node website was contacted to prepare</w:t>
@@ -275,7 +260,7 @@
         <w:t xml:space="preserve">Node Landing Page Verification Checklist v3.0</w:t>
       </w:r>
       <w:r>
-        <w:t xml:space="preserve">, with a pytest suite of 357 hermetic test cases that never touch a node's website, and at most two bounded hops of link following.</w:t>
+        <w:t xml:space="preserve">, with a pytest suite of 369 hermetic test cases that never touch a node's website, and at most two bounded hops of link following.</w:t>
       </w:r>
     </w:p>
     <w:p>
@@ -351,7 +336,7 @@
           <w:b/>
           <w:bCs/>
         </w:rPr>
-        <w:t xml:space="preserve">357 cases</w:t>
+        <w:t xml:space="preserve">369 cases</w:t>
       </w:r>
       <w:r>
         <w:t xml:space="preserve"> </w:t>
@@ -712,7 +697,7 @@
         <w:t xml:space="preserve"> </w:t>
       </w:r>
       <w:r>
-        <w:t xml:space="preserve">address on 25 September, and the published run was collected from the old one, so rebuilding it needs the old node list (section 5). The suite grew from 326 to 329 cases for these changes, to 333 with four tests that keep the command-line help complete, and to 339 with the tests for the URL-mismatch warning and for switching the default checklist revision (section 11). It is now 357, with eighteen cases for</w:t>
+        <w:t xml:space="preserve">address on 25 September, and the published run was collected from the old one, so rebuilding it needs the old node list (section 5). The suite grew from 326 to 329 cases for these changes, to 333 with four tests that keep the command-line help complete, and to 339 with the tests for the URL-mismatch warning and for switching the default checklist revision (section 11). It is 357 with eighteen cases for</w:t>
       </w:r>
       <w:r>
         <w:t xml:space="preserve"> </w:t>
@@ -724,10 +709,7 @@
         <w:t xml:space="preserve">--node</w:t>
       </w:r>
       <w:r>
-        <w:t xml:space="preserve"> </w:t>
-      </w:r>
-      <w:r>
-        <w:t xml:space="preserve">(section 5).</w:t>
+        <w:t xml:space="preserve">, and 369 with twelve for the configuration listings (section 5).</w:t>
       </w:r>
     </w:p>
     <w:p>
@@ -1399,7 +1381,7 @@
           <w:b/>
           <w:bCs/>
         </w:rPr>
-        <w:t xml:space="preserve">288 test functions, expanding to 357 executed cases</w:t>
+        <w:t xml:space="preserve">300 test functions, expanding to 369 executed cases</w:t>
       </w:r>
       <w:r>
         <w:t xml:space="preserve"> </w:t>
@@ -1459,7 +1441,7 @@
         <w:t xml:space="preserve"> </w:t>
       </w:r>
       <w:r>
-        <w:t xml:space="preserve">pointed at an empty directory still yields 357 passed, while</w:t>
+        <w:t xml:space="preserve">pointed at an empty directory still yields 369 passed, while</w:t>
       </w:r>
       <w:r>
         <w:t xml:space="preserve"> </w:t>
@@ -1717,7 +1699,7 @@
               <w:pStyle w:val="Compact"/>
             </w:pPr>
             <w:r>
-              <w:t xml:space="preserve">68</w:t>
+              <w:t xml:space="preserve">80</w:t>
             </w:r>
           </w:p>
         </w:tc>
@@ -1780,6 +1762,54 @@
                 <w:rStyle w:val="VerbatimChar"/>
               </w:rPr>
               <w:t xml:space="preserve">--url</w:t>
+            </w:r>
+            <w:r>
+              <w:t xml:space="preserve">; the configuration listings (</w:t>
+            </w:r>
+            <w:r>
+              <w:rPr>
+                <w:rStyle w:val="VerbatimChar"/>
+              </w:rPr>
+              <w:t xml:space="preserve">--list-nodes</w:t>
+            </w:r>
+            <w:r>
+              <w:t xml:space="preserve">,</w:t>
+            </w:r>
+            <w:r>
+              <w:t xml:space="preserve"> </w:t>
+            </w:r>
+            <w:r>
+              <w:rPr>
+                <w:rStyle w:val="VerbatimChar"/>
+              </w:rPr>
+              <w:t xml:space="preserve">--list-nlps</w:t>
+            </w:r>
+            <w:r>
+              <w:t xml:space="preserve">,</w:t>
+            </w:r>
+            <w:r>
+              <w:t xml:space="preserve"> </w:t>
+            </w:r>
+            <w:r>
+              <w:rPr>
+                <w:rStyle w:val="VerbatimChar"/>
+              </w:rPr>
+              <w:t xml:space="preserve">--list-approved-names</w:t>
+            </w:r>
+            <w:r>
+              <w:t xml:space="preserve">,</w:t>
+            </w:r>
+            <w:r>
+              <w:t xml:space="preserve"> </w:t>
+            </w:r>
+            <w:r>
+              <w:rPr>
+                <w:rStyle w:val="VerbatimChar"/>
+              </w:rPr>
+              <w:t xml:space="preserve">--print-config</w:t>
+            </w:r>
+            <w:r>
+              <w:t xml:space="preserve">)</w:t>
             </w:r>
           </w:p>
         </w:tc>
@@ -1952,7 +1982,7 @@
                 <w:b/>
                 <w:bCs/>
               </w:rPr>
-              <w:t xml:space="preserve">357</w:t>
+              <w:t xml:space="preserve">369</w:t>
             </w:r>
           </w:p>
         </w:tc>
@@ -8560,6 +8590,271 @@
           </w:p>
         </w:tc>
       </w:tr>
+      <w:tr>
+        <w:trPr>
+          <w:cantSplit/>
+        </w:trPr>
+        <w:tc>
+          <w:tcPr/>
+          <w:p>
+            <w:pPr>
+              <w:pStyle w:val="Compact"/>
+            </w:pPr>
+            <w:r>
+              <w:rPr>
+                <w:rStyle w:val="VerbatimChar"/>
+              </w:rPr>
+              <w:t xml:space="preserve">--list-nodes</w:t>
+            </w:r>
+          </w:p>
+        </w:tc>
+        <w:tc>
+          <w:tcPr/>
+          <w:p>
+            <w:pPr>
+              <w:pStyle w:val="Compact"/>
+            </w:pPr>
+            <w:r>
+              <w:rPr>
+                <w:rStyle w:val="VerbatimChar"/>
+              </w:rPr>
+              <w:t xml:space="preserve">basic-check</w:t>
+            </w:r>
+            <w:r>
+              <w:t xml:space="preserve"> </w:t>
+            </w:r>
+            <w:r>
+              <w:t xml:space="preserve">alone</w:t>
+            </w:r>
+          </w:p>
+        </w:tc>
+        <w:tc>
+          <w:tcPr/>
+          <w:p>
+            <w:pPr>
+              <w:pStyle w:val="Compact"/>
+            </w:pPr>
+            <w:r>
+              <w:t xml:space="preserve">—</w:t>
+            </w:r>
+          </w:p>
+        </w:tc>
+        <w:tc>
+          <w:tcPr/>
+          <w:p>
+            <w:pPr>
+              <w:pStyle w:val="Compact"/>
+            </w:pPr>
+            <w:r>
+              <w:t xml:space="preserve">Node ids in</w:t>
+            </w:r>
+            <w:r>
+              <w:t xml:space="preserve"> </w:t>
+            </w:r>
+            <w:r>
+              <w:rPr>
+                <w:rStyle w:val="VerbatimChar"/>
+              </w:rPr>
+              <w:t xml:space="preserve">nodes.yaml</w:t>
+            </w:r>
+            <w:r>
+              <w:t xml:space="preserve">, one per line</w:t>
+            </w:r>
+          </w:p>
+        </w:tc>
+      </w:tr>
+      <w:tr>
+        <w:trPr>
+          <w:cantSplit/>
+        </w:trPr>
+        <w:tc>
+          <w:tcPr/>
+          <w:p>
+            <w:pPr>
+              <w:pStyle w:val="Compact"/>
+            </w:pPr>
+            <w:r>
+              <w:rPr>
+                <w:rStyle w:val="VerbatimChar"/>
+              </w:rPr>
+              <w:t xml:space="preserve">--list-nlps</w:t>
+            </w:r>
+          </w:p>
+        </w:tc>
+        <w:tc>
+          <w:tcPr/>
+          <w:p>
+            <w:pPr>
+              <w:pStyle w:val="Compact"/>
+            </w:pPr>
+            <w:r>
+              <w:rPr>
+                <w:rStyle w:val="VerbatimChar"/>
+              </w:rPr>
+              <w:t xml:space="preserve">basic-check</w:t>
+            </w:r>
+            <w:r>
+              <w:t xml:space="preserve"> </w:t>
+            </w:r>
+            <w:r>
+              <w:t xml:space="preserve">alone</w:t>
+            </w:r>
+          </w:p>
+        </w:tc>
+        <w:tc>
+          <w:tcPr/>
+          <w:p>
+            <w:pPr>
+              <w:pStyle w:val="Compact"/>
+            </w:pPr>
+            <w:r>
+              <w:t xml:space="preserve">—</w:t>
+            </w:r>
+          </w:p>
+        </w:tc>
+        <w:tc>
+          <w:tcPr/>
+          <w:p>
+            <w:pPr>
+              <w:pStyle w:val="Compact"/>
+            </w:pPr>
+            <w:r>
+              <w:t xml:space="preserve">Each node id with its Node Landing Page URL</w:t>
+            </w:r>
+          </w:p>
+        </w:tc>
+      </w:tr>
+      <w:tr>
+        <w:trPr>
+          <w:cantSplit/>
+        </w:trPr>
+        <w:tc>
+          <w:tcPr/>
+          <w:p>
+            <w:pPr>
+              <w:pStyle w:val="Compact"/>
+            </w:pPr>
+            <w:r>
+              <w:rPr>
+                <w:rStyle w:val="VerbatimChar"/>
+              </w:rPr>
+              <w:t xml:space="preserve">--list-approved-names</w:t>
+            </w:r>
+          </w:p>
+        </w:tc>
+        <w:tc>
+          <w:tcPr/>
+          <w:p>
+            <w:pPr>
+              <w:pStyle w:val="Compact"/>
+            </w:pPr>
+            <w:r>
+              <w:rPr>
+                <w:rStyle w:val="VerbatimChar"/>
+              </w:rPr>
+              <w:t xml:space="preserve">basic-check</w:t>
+            </w:r>
+            <w:r>
+              <w:t xml:space="preserve"> </w:t>
+            </w:r>
+            <w:r>
+              <w:t xml:space="preserve">alone</w:t>
+            </w:r>
+          </w:p>
+        </w:tc>
+        <w:tc>
+          <w:tcPr/>
+          <w:p>
+            <w:pPr>
+              <w:pStyle w:val="Compact"/>
+            </w:pPr>
+            <w:r>
+              <w:t xml:space="preserve">—</w:t>
+            </w:r>
+          </w:p>
+        </w:tc>
+        <w:tc>
+          <w:tcPr/>
+          <w:p>
+            <w:pPr>
+              <w:pStyle w:val="Compact"/>
+            </w:pPr>
+            <w:r>
+              <w:t xml:space="preserve">Each node id with its approved name, from</w:t>
+            </w:r>
+            <w:r>
+              <w:t xml:space="preserve"> </w:t>
+            </w:r>
+            <w:r>
+              <w:rPr>
+                <w:rStyle w:val="VerbatimChar"/>
+              </w:rPr>
+              <w:t xml:space="preserve">approved-names-scoped.txt</w:t>
+            </w:r>
+          </w:p>
+        </w:tc>
+      </w:tr>
+      <w:tr>
+        <w:trPr>
+          <w:cantSplit/>
+        </w:trPr>
+        <w:tc>
+          <w:tcPr/>
+          <w:p>
+            <w:pPr>
+              <w:pStyle w:val="Compact"/>
+            </w:pPr>
+            <w:r>
+              <w:rPr>
+                <w:rStyle w:val="VerbatimChar"/>
+              </w:rPr>
+              <w:t xml:space="preserve">--print-config</w:t>
+            </w:r>
+          </w:p>
+        </w:tc>
+        <w:tc>
+          <w:tcPr/>
+          <w:p>
+            <w:pPr>
+              <w:pStyle w:val="Compact"/>
+            </w:pPr>
+            <w:r>
+              <w:rPr>
+                <w:rStyle w:val="VerbatimChar"/>
+              </w:rPr>
+              <w:t xml:space="preserve">basic-check</w:t>
+            </w:r>
+            <w:r>
+              <w:t xml:space="preserve"> </w:t>
+            </w:r>
+            <w:r>
+              <w:t xml:space="preserve">alone</w:t>
+            </w:r>
+          </w:p>
+        </w:tc>
+        <w:tc>
+          <w:tcPr/>
+          <w:p>
+            <w:pPr>
+              <w:pStyle w:val="Compact"/>
+            </w:pPr>
+            <w:r>
+              <w:t xml:space="preserve">—</w:t>
+            </w:r>
+          </w:p>
+        </w:tc>
+        <w:tc>
+          <w:tcPr/>
+          <w:p>
+            <w:pPr>
+              <w:pStyle w:val="Compact"/>
+            </w:pPr>
+            <w:r>
+              <w:t xml:space="preserve">Table of id, Node Landing Page URL and approved name, one row per node, with the source files</w:t>
+            </w:r>
+          </w:p>
+        </w:tc>
+      </w:tr>
     </w:tbl>
     <w:p>
       <w:pPr>
@@ -8609,6 +8904,171 @@
       </w:r>
       <w:r>
         <w:t xml:space="preserve">, so a combined run uses the default cap of 8. Use the two commands separately if you need to change it.</w:t>
+      </w:r>
+    </w:p>
+    <w:p>
+      <w:pPr>
+        <w:pStyle w:val="BodyText"/>
+      </w:pPr>
+      <w:r>
+        <w:rPr>
+          <w:b/>
+          <w:bCs/>
+        </w:rPr>
+        <w:t xml:space="preserve">Listing the configuration.</w:t>
+      </w:r>
+      <w:r>
+        <w:t xml:space="preserve"> </w:t>
+      </w:r>
+      <w:r>
+        <w:rPr>
+          <w:rStyle w:val="VerbatimChar"/>
+        </w:rPr>
+        <w:t xml:space="preserve">basic-check --list-nodes</w:t>
+      </w:r>
+      <w:r>
+        <w:t xml:space="preserve">,</w:t>
+      </w:r>
+      <w:r>
+        <w:t xml:space="preserve"> </w:t>
+      </w:r>
+      <w:r>
+        <w:rPr>
+          <w:rStyle w:val="VerbatimChar"/>
+        </w:rPr>
+        <w:t xml:space="preserve">--list-nlps</w:t>
+      </w:r>
+      <w:r>
+        <w:t xml:space="preserve">,</w:t>
+      </w:r>
+      <w:r>
+        <w:t xml:space="preserve"> </w:t>
+      </w:r>
+      <w:r>
+        <w:rPr>
+          <w:rStyle w:val="VerbatimChar"/>
+        </w:rPr>
+        <w:t xml:space="preserve">--list-approved-names</w:t>
+      </w:r>
+      <w:r>
+        <w:t xml:space="preserve"> </w:t>
+      </w:r>
+      <w:r>
+        <w:t xml:space="preserve">and</w:t>
+      </w:r>
+      <w:r>
+        <w:t xml:space="preserve"> </w:t>
+      </w:r>
+      <w:r>
+        <w:rPr>
+          <w:rStyle w:val="VerbatimChar"/>
+        </w:rPr>
+        <w:t xml:space="preserve">--print-config</w:t>
+      </w:r>
+      <w:r>
+        <w:t xml:space="preserve"> </w:t>
+      </w:r>
+      <w:r>
+        <w:t xml:space="preserve">print what is configured and exit, without contacting any node: the ids, each id with its landing page URL, each id with its approved name, or all three in one table. Approved names come from</w:t>
+      </w:r>
+      <w:r>
+        <w:t xml:space="preserve"> </w:t>
+      </w:r>
+      <w:r>
+        <w:rPr>
+          <w:rStyle w:val="VerbatimChar"/>
+        </w:rPr>
+        <w:t xml:space="preserve">checklist/approved-names-scoped.txt</w:t>
+      </w:r>
+      <w:r>
+        <w:t xml:space="preserve">, the copy that ties each name to a node; the table notes that</w:t>
+      </w:r>
+      <w:r>
+        <w:t xml:space="preserve"> </w:t>
+      </w:r>
+      <w:r>
+        <w:rPr>
+          <w:rStyle w:val="VerbatimChar"/>
+        </w:rPr>
+        <w:t xml:space="preserve">assess</w:t>
+      </w:r>
+      <w:r>
+        <w:t xml:space="preserve"> </w:t>
+      </w:r>
+      <w:r>
+        <w:t xml:space="preserve">uses the unscoped</w:t>
+      </w:r>
+      <w:r>
+        <w:t xml:space="preserve"> </w:t>
+      </w:r>
+      <w:r>
+        <w:rPr>
+          <w:rStyle w:val="VerbatimChar"/>
+        </w:rPr>
+        <w:t xml:space="preserve">approved-names.txt</w:t>
+      </w:r>
+      <w:r>
+        <w:t xml:space="preserve"> </w:t>
+      </w:r>
+      <w:r>
+        <w:t xml:space="preserve">by default. Output is plain columns, never wrapped. Twelve cases in</w:t>
+      </w:r>
+      <w:r>
+        <w:t xml:space="preserve"> </w:t>
+      </w:r>
+      <w:r>
+        <w:rPr>
+          <w:rStyle w:val="VerbatimChar"/>
+        </w:rPr>
+        <w:t xml:space="preserve">test_cli.py</w:t>
+      </w:r>
+      <w:r>
+        <w:t xml:space="preserve"> </w:t>
+      </w:r>
+      <w:r>
+        <w:t xml:space="preserve">check each listing against</w:t>
+      </w:r>
+      <w:r>
+        <w:t xml:space="preserve"> </w:t>
+      </w:r>
+      <w:r>
+        <w:rPr>
+          <w:rStyle w:val="VerbatimChar"/>
+        </w:rPr>
+        <w:t xml:space="preserve">nodes.yaml</w:t>
+      </w:r>
+      <w:r>
+        <w:t xml:space="preserve"> </w:t>
+      </w:r>
+      <w:r>
+        <w:t xml:space="preserve">and the scoped file row by row, that flags combine, that a long URL stays on one line at 40 columns, that a node with no name shows</w:t>
+      </w:r>
+      <w:r>
+        <w:t xml:space="preserve"> </w:t>
+      </w:r>
+      <w:r>
+        <w:rPr>
+          <w:rStyle w:val="VerbatimChar"/>
+        </w:rPr>
+        <w:t xml:space="preserve">(none)</w:t>
+      </w:r>
+      <w:r>
+        <w:t xml:space="preserve">, that an unreadable node list is a clear error, that the flags are refused with a command, that a bare</w:t>
+      </w:r>
+      <w:r>
+        <w:t xml:space="preserve"> </w:t>
+      </w:r>
+      <w:r>
+        <w:rPr>
+          <w:rStyle w:val="VerbatimChar"/>
+        </w:rPr>
+        <w:t xml:space="preserve">basic-check</w:t>
+      </w:r>
+      <w:r>
+        <w:t xml:space="preserve"> </w:t>
+      </w:r>
+      <w:r>
+        <w:t xml:space="preserve">still asks for one, and that no listing fetches anything.</w:t>
       </w:r>
     </w:p>
     <w:bookmarkEnd w:id="23"/>
@@ -13010,7 +13470,7 @@
         <w:rPr>
           <w:rStyle w:val="CommentTok"/>
         </w:rPr>
-        <w:t xml:space="preserve"># 357 cases, ~5-6 s, no network, no browser</w:t>
+        <w:t xml:space="preserve"># 369 cases, ~5-6 s, no network, no browser</w:t>
       </w:r>
       <w:r>
         <w:br/>
@@ -14477,7 +14937,7 @@
         <w:rPr>
           <w:rStyle w:val="CommentTok"/>
         </w:rPr>
-        <w:t xml:space="preserve"># 6 - run the suite: 357 cases, ~5-6 s, no network, no browser</w:t>
+        <w:t xml:space="preserve"># 6 - run the suite: 369 cases, ~5-6 s, no network, no browser</w:t>
       </w:r>
       <w:r>
         <w:br/>
@@ -23069,7 +23529,7 @@
         <w:rPr>
           <w:rStyle w:val="VerbatimChar"/>
         </w:rPr>
-        <w:t xml:space="preserve">5701f9e</w:t>
+        <w:t xml:space="preserve">51a5332</w:t>
       </w:r>
       <w:r>
         <w:t xml:space="preserve">), not carried over from the previous edition</w:t>

</xml_diff>